<commit_message>
4th july dairy entry.
</commit_message>
<xml_diff>
--- a/Internship Daily Diary - Aryan Barbate.docx
+++ b/Internship Daily Diary - Aryan Barbate.docx
@@ -1048,7 +1048,7 @@
           </w:tcPr>
           <w:p>
             <w:r>
-              <w:t>Studied Git and version-control fundamentals using a cheat sheet — repository cloning, staging, committing, pushing, branching and merging; understood the collaborative GitHub workflow.</w:t>
+              <w:t>Studied Git and version-control fundamentals— repository cloning, staging, committing, pushing, branching and merging; understood the collaborative GitHub workflow.</w:t>
             </w:r>
           </w:p>
         </w:tc>
@@ -2300,7 +2300,10 @@
           </w:tcPr>
           <w:p>
             <w:r>
-              <w:t>-</w:t>
+              <w:t>Basic Command line commands and also work with log files , users login and directory</w:t>
+            </w:r>
+            <w:r>
+              <w:t xml:space="preserve"> work</w:t>
             </w:r>
           </w:p>
         </w:tc>
@@ -2310,7 +2313,34 @@
           </w:tcPr>
           <w:p>
             <w:r>
-              <w:t>-</w:t>
+              <w:rPr>
+                <w:b/>
+              </w:rPr>
+              <w:t>Task</w:t>
+            </w:r>
+            <w:r>
+              <w:rPr>
+                <w:b/>
+              </w:rPr>
+              <w:t>:</w:t>
+            </w:r>
+            <w:r>
+              <w:rPr>
+                <w:b/>
+              </w:rPr>
+              <w:t xml:space="preserve"> </w:t>
+            </w:r>
+            <w:r>
+              <w:t xml:space="preserve">Implement the </w:t>
+            </w:r>
+            <w:r>
+              <w:t xml:space="preserve">command on log file </w:t>
+            </w:r>
+            <w:r>
+              <w:t xml:space="preserve">to </w:t>
+            </w:r>
+            <w:r>
+              <w:t xml:space="preserve">analyze the user logins and DB activities </w:t>
             </w:r>
           </w:p>
         </w:tc>
@@ -2890,7 +2920,10 @@
           </w:tcPr>
           <w:p>
             <w:r>
-              <w:t>-</w:t>
+              <w:t xml:space="preserve">Group Presentation on the Agile Methodology and it </w:t>
+            </w:r>
+            <w:r>
+              <w:t>full history</w:t>
             </w:r>
           </w:p>
         </w:tc>
@@ -2899,8 +2932,28 @@
             <w:tcW w:w="2101" w:type="dxa"/>
           </w:tcPr>
           <w:p>
-            <w:r>
-              <w:t>-</w:t>
+            <w:pPr>
+              <w:rPr>
+                <w:bCs/>
+              </w:rPr>
+            </w:pPr>
+            <w:r>
+              <w:rPr>
+                <w:b/>
+              </w:rPr>
+              <w:t>Task:</w:t>
+            </w:r>
+            <w:r>
+              <w:rPr>
+                <w:b/>
+              </w:rPr>
+              <w:t xml:space="preserve"> </w:t>
+            </w:r>
+            <w:r>
+              <w:rPr>
+                <w:bCs/>
+              </w:rPr>
+              <w:t>create a Group presentation on Agile</w:t>
             </w:r>
           </w:p>
         </w:tc>
@@ -3010,7 +3063,7 @@
           </w:tcPr>
           <w:p>
             <w:r>
-              <w:t>-</w:t>
+              <w:t>CSS Grid Layout — grid-template-columns/rows, line-based positioning with grid-column/grid-row, and using empty tracks for gaps.</w:t>
             </w:r>
           </w:p>
         </w:tc>
@@ -3019,8 +3072,28 @@
             <w:tcW w:w="2101" w:type="dxa"/>
           </w:tcPr>
           <w:p>
-            <w:r>
-              <w:t>-</w:t>
+            <w:pPr>
+              <w:rPr>
+                <w:bCs/>
+              </w:rPr>
+            </w:pPr>
+            <w:r>
+              <w:rPr>
+                <w:b/>
+              </w:rPr>
+              <w:t>Task</w:t>
+            </w:r>
+            <w:r>
+              <w:rPr>
+                <w:b/>
+              </w:rPr>
+              <w:t xml:space="preserve">: </w:t>
+            </w:r>
+            <w:r>
+              <w:rPr>
+                <w:bCs/>
+              </w:rPr>
+              <w:t>Create an "Exact Layout" containing boxes arranged in grid using precise grid line placement.</w:t>
             </w:r>
           </w:p>
         </w:tc>

</xml_diff>

<commit_message>
6th july dairy entry.
</commit_message>
<xml_diff>
--- a/Internship Daily Diary - Aryan Barbate.docx
+++ b/Internship Daily Diary - Aryan Barbate.docx
@@ -20,7 +20,23 @@
           <w:b/>
           <w:sz w:val="32"/>
         </w:rPr>
-        <w:t>Name of the Student :    Aryan Navnath Barbate</w:t>
+        <w:t xml:space="preserve">Name of the </w:t>
+      </w:r>
+      <w:proofErr w:type="gramStart"/>
+      <w:r>
+        <w:rPr>
+          <w:b/>
+          <w:sz w:val="32"/>
+        </w:rPr>
+        <w:t>Student :</w:t>
+      </w:r>
+      <w:proofErr w:type="gramEnd"/>
+      <w:r>
+        <w:rPr>
+          <w:b/>
+          <w:sz w:val="32"/>
+        </w:rPr>
+        <w:t xml:space="preserve">    Aryan Navnath Barbate</w:t>
       </w:r>
     </w:p>
     <w:p>
@@ -29,7 +45,23 @@
           <w:b/>
           <w:sz w:val="32"/>
         </w:rPr>
-        <w:t xml:space="preserve">Department Name :    </w:t>
+        <w:t xml:space="preserve">Department </w:t>
+      </w:r>
+      <w:proofErr w:type="gramStart"/>
+      <w:r>
+        <w:rPr>
+          <w:b/>
+          <w:sz w:val="32"/>
+        </w:rPr>
+        <w:t>Name :</w:t>
+      </w:r>
+      <w:proofErr w:type="gramEnd"/>
+      <w:r>
+        <w:rPr>
+          <w:b/>
+          <w:sz w:val="32"/>
+        </w:rPr>
+        <w:t xml:space="preserve">    </w:t>
       </w:r>
       <w:r>
         <w:rPr>
@@ -45,8 +77,49 @@
           <w:b/>
           <w:sz w:val="32"/>
         </w:rPr>
-        <w:t>Internship Duration :    14 Week ( 1 June to 31 August 2026 )</w:t>
+        <w:t xml:space="preserve">Internship </w:t>
       </w:r>
+      <w:proofErr w:type="gramStart"/>
+      <w:r>
+        <w:rPr>
+          <w:b/>
+          <w:sz w:val="32"/>
+        </w:rPr>
+        <w:t>Duration :</w:t>
+      </w:r>
+      <w:proofErr w:type="gramEnd"/>
+      <w:r>
+        <w:rPr>
+          <w:b/>
+          <w:sz w:val="32"/>
+        </w:rPr>
+        <w:t xml:space="preserve">    14 Week </w:t>
+      </w:r>
+      <w:proofErr w:type="gramStart"/>
+      <w:r>
+        <w:rPr>
+          <w:b/>
+          <w:sz w:val="32"/>
+        </w:rPr>
+        <w:t>( 1</w:t>
+      </w:r>
+      <w:proofErr w:type="gramEnd"/>
+      <w:r>
+        <w:rPr>
+          <w:b/>
+          <w:sz w:val="32"/>
+        </w:rPr>
+        <w:t xml:space="preserve"> June to 31 August </w:t>
+      </w:r>
+      <w:proofErr w:type="gramStart"/>
+      <w:r>
+        <w:rPr>
+          <w:b/>
+          <w:sz w:val="32"/>
+        </w:rPr>
+        <w:t>2026 )</w:t>
+      </w:r>
+      <w:proofErr w:type="gramEnd"/>
     </w:p>
     <w:p>
       <w:pPr>
@@ -61,7 +134,39 @@
           <w:b/>
           <w:sz w:val="32"/>
         </w:rPr>
-        <w:t xml:space="preserve">Name of the mentor ( Faculty ) :    </w:t>
+        <w:t xml:space="preserve">Name of the mentor </w:t>
+      </w:r>
+      <w:proofErr w:type="gramStart"/>
+      <w:r>
+        <w:rPr>
+          <w:b/>
+          <w:sz w:val="32"/>
+        </w:rPr>
+        <w:t>( Faculty</w:t>
+      </w:r>
+      <w:proofErr w:type="gramEnd"/>
+      <w:r>
+        <w:rPr>
+          <w:b/>
+          <w:sz w:val="32"/>
+        </w:rPr>
+        <w:t xml:space="preserve"> </w:t>
+      </w:r>
+      <w:proofErr w:type="gramStart"/>
+      <w:r>
+        <w:rPr>
+          <w:b/>
+          <w:sz w:val="32"/>
+        </w:rPr>
+        <w:t>) :</w:t>
+      </w:r>
+      <w:proofErr w:type="gramEnd"/>
+      <w:r>
+        <w:rPr>
+          <w:b/>
+          <w:sz w:val="32"/>
+        </w:rPr>
+        <w:t xml:space="preserve">    </w:t>
       </w:r>
       <w:r>
         <w:rPr>
@@ -69,8 +174,18 @@
           <w:sz w:val="32"/>
           <w:lang w:val="en-IN"/>
         </w:rPr>
-        <w:t>Smt. J. G. Dabhade</w:t>
+        <w:t xml:space="preserve">Smt. J. G. </w:t>
       </w:r>
+      <w:proofErr w:type="spellStart"/>
+      <w:r>
+        <w:rPr>
+          <w:b/>
+          <w:sz w:val="32"/>
+          <w:lang w:val="en-IN"/>
+        </w:rPr>
+        <w:t>Dabhade</w:t>
+      </w:r>
+      <w:proofErr w:type="spellEnd"/>
     </w:p>
     <w:p>
       <w:r>
@@ -78,7 +193,23 @@
           <w:b/>
           <w:sz w:val="32"/>
         </w:rPr>
-        <w:t xml:space="preserve">Enrollment Number :    </w:t>
+        <w:t xml:space="preserve">Enrollment </w:t>
+      </w:r>
+      <w:proofErr w:type="gramStart"/>
+      <w:r>
+        <w:rPr>
+          <w:b/>
+          <w:sz w:val="32"/>
+        </w:rPr>
+        <w:t>Number :</w:t>
+      </w:r>
+      <w:proofErr w:type="gramEnd"/>
+      <w:r>
+        <w:rPr>
+          <w:b/>
+          <w:sz w:val="32"/>
+        </w:rPr>
+        <w:t xml:space="preserve">    </w:t>
       </w:r>
       <w:r>
         <w:rPr>
@@ -94,7 +225,39 @@
           <w:b/>
           <w:sz w:val="32"/>
         </w:rPr>
-        <w:t xml:space="preserve">Name of the mentor ( Industry ) :    </w:t>
+        <w:t xml:space="preserve">Name of the mentor </w:t>
+      </w:r>
+      <w:proofErr w:type="gramStart"/>
+      <w:r>
+        <w:rPr>
+          <w:b/>
+          <w:sz w:val="32"/>
+        </w:rPr>
+        <w:t>( Industry</w:t>
+      </w:r>
+      <w:proofErr w:type="gramEnd"/>
+      <w:r>
+        <w:rPr>
+          <w:b/>
+          <w:sz w:val="32"/>
+        </w:rPr>
+        <w:t xml:space="preserve"> </w:t>
+      </w:r>
+      <w:proofErr w:type="gramStart"/>
+      <w:r>
+        <w:rPr>
+          <w:b/>
+          <w:sz w:val="32"/>
+        </w:rPr>
+        <w:t>) :</w:t>
+      </w:r>
+      <w:proofErr w:type="gramEnd"/>
+      <w:r>
+        <w:rPr>
+          <w:b/>
+          <w:sz w:val="32"/>
+        </w:rPr>
+        <w:t xml:space="preserve">    </w:t>
       </w:r>
       <w:r>
         <w:rPr>
@@ -105,12 +268,21 @@
       </w:r>
     </w:p>
     <w:p>
+      <w:proofErr w:type="gramStart"/>
       <w:r>
         <w:rPr>
           <w:b/>
           <w:sz w:val="32"/>
         </w:rPr>
-        <w:t xml:space="preserve">Semester :    </w:t>
+        <w:t>Semester :</w:t>
+      </w:r>
+      <w:proofErr w:type="gramEnd"/>
+      <w:r>
+        <w:rPr>
+          <w:b/>
+          <w:sz w:val="32"/>
+        </w:rPr>
+        <w:t xml:space="preserve">    </w:t>
       </w:r>
       <w:r>
         <w:rPr>
@@ -141,7 +313,23 @@
           <w:b/>
           <w:sz w:val="32"/>
         </w:rPr>
-        <w:t>Academic Year :    2026-27</w:t>
+        <w:t xml:space="preserve">Academic </w:t>
+      </w:r>
+      <w:proofErr w:type="gramStart"/>
+      <w:r>
+        <w:rPr>
+          <w:b/>
+          <w:sz w:val="32"/>
+        </w:rPr>
+        <w:t>Year :</w:t>
+      </w:r>
+      <w:proofErr w:type="gramEnd"/>
+      <w:r>
+        <w:rPr>
+          <w:b/>
+          <w:sz w:val="32"/>
+        </w:rPr>
+        <w:t xml:space="preserve">    2026-27</w:t>
       </w:r>
     </w:p>
     <w:p>
@@ -234,7 +422,21 @@
               <w:rPr>
                 <w:b/>
               </w:rPr>
-              <w:t>Details of Work Allotted Till Next Session /Corrections Suggested/Faculty Remarks</w:t>
+              <w:t xml:space="preserve">Details of Work Allotted </w:t>
+            </w:r>
+            <w:proofErr w:type="gramStart"/>
+            <w:r>
+              <w:rPr>
+                <w:b/>
+              </w:rPr>
+              <w:t>Till</w:t>
+            </w:r>
+            <w:proofErr w:type="gramEnd"/>
+            <w:r>
+              <w:rPr>
+                <w:b/>
+              </w:rPr>
+              <w:t xml:space="preserve"> Next Session /Corrections Suggested/Faculty Remarks</w:t>
             </w:r>
           </w:p>
         </w:tc>
@@ -314,7 +516,15 @@
           </w:tcPr>
           <w:p>
             <w:r>
-              <w:t>Introduction to the internship and overview of the MERN stack (MongoDB, Express, React, Node.js); studied the front-end and back-end execution flow. Practised basic HTML page structure and inline JavaScript event handling; developed an IPL team showcase page using headings, images and a button event.</w:t>
+              <w:t xml:space="preserve">Introduction to the internship and overview of the MERN stack (MongoDB, Express, React, Node.js); studied the front-end and back-end execution flow. </w:t>
+            </w:r>
+            <w:proofErr w:type="spellStart"/>
+            <w:r>
+              <w:t>Practised</w:t>
+            </w:r>
+            <w:proofErr w:type="spellEnd"/>
+            <w:r>
+              <w:t xml:space="preserve"> basic HTML page structure and inline JavaScript event handling; developed an IPL team showcase page using headings, images and a button event.</w:t>
             </w:r>
           </w:p>
         </w:tc>
@@ -380,7 +590,15 @@
           </w:tcPr>
           <w:p>
             <w:r>
-              <w:t>Studied JavaScript variables — var, let and const — covering redeclaration, reinitialization and hoisting. Built a bill-calculator page and a login page and verified variable-scope behaviour through hands-on practice.</w:t>
+              <w:t xml:space="preserve">Studied JavaScript variables — var, let and const — covering redeclaration, reinitialization and hoisting. Built a bill-calculator page and a login page and verified variable-scope </w:t>
+            </w:r>
+            <w:proofErr w:type="spellStart"/>
+            <w:r>
+              <w:t>behaviour</w:t>
+            </w:r>
+            <w:proofErr w:type="spellEnd"/>
+            <w:r>
+              <w:t xml:space="preserve"> through hands-on practice.</w:t>
             </w:r>
           </w:p>
         </w:tc>
@@ -395,8 +613,13 @@
               </w:rPr>
               <w:t xml:space="preserve">Task: </w:t>
             </w:r>
-            <w:r>
-              <w:t>Practise HTML markup by creating multiple structured pages using tables, lists and forms.</w:t>
+            <w:proofErr w:type="spellStart"/>
+            <w:r>
+              <w:t>Practise</w:t>
+            </w:r>
+            <w:proofErr w:type="spellEnd"/>
+            <w:r>
+              <w:t xml:space="preserve"> HTML markup by creating multiple structured pages using tables, lists and forms.</w:t>
             </w:r>
           </w:p>
         </w:tc>
@@ -462,7 +685,23 @@
               <w:t xml:space="preserve">Task: </w:t>
             </w:r>
             <w:r>
-              <w:t>Continue practising HTML markup with three additional layout tasks emphasising tables and forms.</w:t>
+              <w:t xml:space="preserve">Continue </w:t>
+            </w:r>
+            <w:proofErr w:type="spellStart"/>
+            <w:r>
+              <w:t>practising</w:t>
+            </w:r>
+            <w:proofErr w:type="spellEnd"/>
+            <w:r>
+              <w:t xml:space="preserve"> HTML markup with three additional layout tasks </w:t>
+            </w:r>
+            <w:proofErr w:type="spellStart"/>
+            <w:r>
+              <w:t>emphasising</w:t>
+            </w:r>
+            <w:proofErr w:type="spellEnd"/>
+            <w:r>
+              <w:t xml:space="preserve"> tables and forms.</w:t>
             </w:r>
           </w:p>
         </w:tc>
@@ -511,8 +750,13 @@
             <w:tcW w:w="3738" w:type="dxa"/>
           </w:tcPr>
           <w:p>
-            <w:r>
-              <w:t>Practised three additional HTML markup drills focusing on nested structures, tabular data presentation and form construction with varied input controls.</w:t>
+            <w:proofErr w:type="spellStart"/>
+            <w:r>
+              <w:t>Practised</w:t>
+            </w:r>
+            <w:proofErr w:type="spellEnd"/>
+            <w:r>
+              <w:t xml:space="preserve"> three additional HTML markup drills focusing on nested structures, tabular data presentation and form construction with varied input controls.</w:t>
             </w:r>
           </w:p>
         </w:tc>
@@ -528,7 +772,15 @@
               <w:t xml:space="preserve">Task: </w:t>
             </w:r>
             <w:r>
-              <w:t>Solve twenty mini HTML tasks covering headings, formatting, links, images, lists, tables and forms.</w:t>
+              <w:t xml:space="preserve">Solve twenty </w:t>
+            </w:r>
+            <w:proofErr w:type="gramStart"/>
+            <w:r>
+              <w:t>mini HTML</w:t>
+            </w:r>
+            <w:proofErr w:type="gramEnd"/>
+            <w:r>
+              <w:t xml:space="preserve"> tasks covering headings, formatting, links, images, lists, tables and forms.</w:t>
             </w:r>
           </w:p>
         </w:tc>
@@ -644,7 +896,15 @@
           </w:tcPr>
           <w:p>
             <w:r>
-              <w:t>Built HTML pages demonstrating ordered, unordered and nested lists along with a formatted table to organise structured data effectively.</w:t>
+              <w:t xml:space="preserve">Built HTML pages demonstrating ordered, unordered and nested lists along with a formatted table to </w:t>
+            </w:r>
+            <w:proofErr w:type="spellStart"/>
+            <w:r>
+              <w:t>organise</w:t>
+            </w:r>
+            <w:proofErr w:type="spellEnd"/>
+            <w:r>
+              <w:t xml:space="preserve"> structured data effectively.</w:t>
             </w:r>
           </w:p>
         </w:tc>
@@ -836,7 +1096,21 @@
               <w:rPr>
                 <w:b/>
               </w:rPr>
-              <w:t>Details of Work Allotted Till Next Session /Corrections Suggested/Faculty Remarks</w:t>
+              <w:t xml:space="preserve">Details of Work Allotted </w:t>
+            </w:r>
+            <w:proofErr w:type="gramStart"/>
+            <w:r>
+              <w:rPr>
+                <w:b/>
+              </w:rPr>
+              <w:t>Till</w:t>
+            </w:r>
+            <w:proofErr w:type="gramEnd"/>
+            <w:r>
+              <w:rPr>
+                <w:b/>
+              </w:rPr>
+              <w:t xml:space="preserve"> Next Session /Corrections Suggested/Faculty Remarks</w:t>
             </w:r>
           </w:p>
         </w:tc>
@@ -915,8 +1189,13 @@
             <w:tcW w:w="3738" w:type="dxa"/>
           </w:tcPr>
           <w:p>
-            <w:r>
-              <w:t>Practised JavaScript while loops — forward and reverse counting, summation and factorial computation. Built a login form and a live time-display page using JavaScript.</w:t>
+            <w:proofErr w:type="spellStart"/>
+            <w:r>
+              <w:t>Practised</w:t>
+            </w:r>
+            <w:proofErr w:type="spellEnd"/>
+            <w:r>
+              <w:t xml:space="preserve"> JavaScript while loops — forward and reverse counting, summation and factorial computation. Built a login form and a live time-display page using JavaScript.</w:t>
             </w:r>
           </w:p>
         </w:tc>
@@ -1245,8 +1524,13 @@
             <w:tcW w:w="3738" w:type="dxa"/>
           </w:tcPr>
           <w:p>
-            <w:r>
-              <w:t>Practised CSS layouts by cloning the Flipkart login page using flexbox, building geometric CSS shapes with border-radius and transforms, and styling a profile/resume page.</w:t>
+            <w:proofErr w:type="spellStart"/>
+            <w:r>
+              <w:t>Practised</w:t>
+            </w:r>
+            <w:proofErr w:type="spellEnd"/>
+            <w:r>
+              <w:t xml:space="preserve"> CSS layouts by cloning the Flipkart login page using flexbox, building geometric CSS shapes with border-radius and transforms, and styling a profile/resume page.</w:t>
             </w:r>
           </w:p>
         </w:tc>
@@ -1262,7 +1546,15 @@
               <w:t xml:space="preserve">Task: </w:t>
             </w:r>
             <w:r>
-              <w:t>Revise JavaScript arrays (forEach, filter) and build an interactive Todo List application.</w:t>
+              <w:t>Revise JavaScript arrays (</w:t>
+            </w:r>
+            <w:proofErr w:type="spellStart"/>
+            <w:r>
+              <w:t>forEach</w:t>
+            </w:r>
+            <w:proofErr w:type="spellEnd"/>
+            <w:r>
+              <w:t>, filter) and build an interactive Todo List application.</w:t>
             </w:r>
           </w:p>
         </w:tc>
@@ -1432,7 +1724,21 @@
               <w:rPr>
                 <w:b/>
               </w:rPr>
-              <w:t>Details of Work Allotted Till Next Session /Corrections Suggested/Faculty Remarks</w:t>
+              <w:t xml:space="preserve">Details of Work Allotted </w:t>
+            </w:r>
+            <w:proofErr w:type="gramStart"/>
+            <w:r>
+              <w:rPr>
+                <w:b/>
+              </w:rPr>
+              <w:t>Till</w:t>
+            </w:r>
+            <w:proofErr w:type="gramEnd"/>
+            <w:r>
+              <w:rPr>
+                <w:b/>
+              </w:rPr>
+              <w:t xml:space="preserve"> Next Session /Corrections Suggested/Faculty Remarks</w:t>
             </w:r>
           </w:p>
         </w:tc>
@@ -1512,7 +1818,15 @@
           </w:tcPr>
           <w:p>
             <w:r>
-              <w:t>Studied JavaScript array methods — forEach iteration and filtering — and developed an interactive Todo List application supporting add, delete and update operations.</w:t>
+              <w:t xml:space="preserve">Studied JavaScript array methods — </w:t>
+            </w:r>
+            <w:proofErr w:type="spellStart"/>
+            <w:r>
+              <w:t>forEach</w:t>
+            </w:r>
+            <w:proofErr w:type="spellEnd"/>
+            <w:r>
+              <w:t xml:space="preserve"> iteration and filtering — and developed an interactive Todo List application supporting add, delete and update operations.</w:t>
             </w:r>
           </w:p>
         </w:tc>
@@ -1637,8 +1951,13 @@
             <w:tcW w:w="3738" w:type="dxa"/>
           </w:tcPr>
           <w:p>
-            <w:r>
-              <w:t>Practised JavaScript objects including nested-object iteration using for…in; built a product-listing page that dynamically renders product cards from an array of objects.</w:t>
+            <w:proofErr w:type="spellStart"/>
+            <w:r>
+              <w:t>Practised</w:t>
+            </w:r>
+            <w:proofErr w:type="spellEnd"/>
+            <w:r>
+              <w:t xml:space="preserve"> JavaScript objects including nested-object iteration using for…in; built a product-listing page that dynamically renders product cards from an array of objects.</w:t>
             </w:r>
           </w:p>
         </w:tc>
@@ -1704,7 +2023,15 @@
           </w:tcPr>
           <w:p>
             <w:r>
-              <w:t>Recreated the Instagram logo purely with CSS using linear gradients, border-radius and ::before/::after pseudo-elements for the camera outline and lens.</w:t>
+              <w:t xml:space="preserve">Recreated the Instagram logo purely with CSS using linear gradients, border-radius </w:t>
+            </w:r>
+            <w:proofErr w:type="gramStart"/>
+            <w:r>
+              <w:t>and ::before/::</w:t>
+            </w:r>
+            <w:proofErr w:type="gramEnd"/>
+            <w:r>
+              <w:t>after pseudo-elements for the camera outline and lens.</w:t>
             </w:r>
           </w:p>
         </w:tc>
@@ -2022,7 +2349,21 @@
               <w:rPr>
                 <w:b/>
               </w:rPr>
-              <w:t>Details of Work Allotted Till Next Session /Corrections Suggested/Faculty Remarks</w:t>
+              <w:t xml:space="preserve">Details of Work Allotted </w:t>
+            </w:r>
+            <w:proofErr w:type="gramStart"/>
+            <w:r>
+              <w:rPr>
+                <w:b/>
+              </w:rPr>
+              <w:t>Till</w:t>
+            </w:r>
+            <w:proofErr w:type="gramEnd"/>
+            <w:r>
+              <w:rPr>
+                <w:b/>
+              </w:rPr>
+              <w:t xml:space="preserve"> Next Session /Corrections Suggested/Faculty Remarks</w:t>
             </w:r>
           </w:p>
         </w:tc>
@@ -2168,7 +2509,15 @@
           </w:tcPr>
           <w:p>
             <w:r>
-              <w:t>Built a text-converter utility (uppercase, lowercase, word count) using JavaScript string methods, and a responsive 'PhotoFolio' gallery page with a fixed header, dropdown menu and CSS-grid gallery.</w:t>
+              <w:t>Built a text-converter utility (uppercase, lowercase, word count) using JavaScript string methods, and a responsive '</w:t>
+            </w:r>
+            <w:proofErr w:type="spellStart"/>
+            <w:r>
+              <w:t>PhotoFolio</w:t>
+            </w:r>
+            <w:proofErr w:type="spellEnd"/>
+            <w:r>
+              <w:t>' gallery page with a fixed header, dropdown menu and CSS-grid gallery.</w:t>
             </w:r>
           </w:p>
         </w:tc>
@@ -2234,7 +2583,15 @@
           </w:tcPr>
           <w:p>
             <w:r>
-              <w:t>Built a CSS traffic-light simulator with red, yellow and green signals that toggle in sequence on button click using JavaScript classList manipulation.</w:t>
+              <w:t xml:space="preserve">Built a CSS traffic-light simulator with red, yellow and green signals that toggle in sequence on button click using JavaScript </w:t>
+            </w:r>
+            <w:proofErr w:type="spellStart"/>
+            <w:r>
+              <w:t>classList</w:t>
+            </w:r>
+            <w:proofErr w:type="spellEnd"/>
+            <w:r>
+              <w:t xml:space="preserve"> manipulation.</w:t>
             </w:r>
           </w:p>
         </w:tc>
@@ -2300,7 +2657,23 @@
           </w:tcPr>
           <w:p>
             <w:r>
-              <w:t>Basic Command line commands and also work with log files , users login and directory</w:t>
+              <w:t xml:space="preserve">Basic Command line commands and also work with log </w:t>
+            </w:r>
+            <w:proofErr w:type="gramStart"/>
+            <w:r>
+              <w:t>files ,</w:t>
+            </w:r>
+            <w:proofErr w:type="gramEnd"/>
+            <w:r>
+              <w:t xml:space="preserve"> </w:t>
+            </w:r>
+            <w:proofErr w:type="gramStart"/>
+            <w:r>
+              <w:t>users</w:t>
+            </w:r>
+            <w:proofErr w:type="gramEnd"/>
+            <w:r>
+              <w:t xml:space="preserve"> login and directory</w:t>
             </w:r>
             <w:r>
               <w:t xml:space="preserve"> work</w:t>
@@ -2316,13 +2689,7 @@
               <w:rPr>
                 <w:b/>
               </w:rPr>
-              <w:t>Task</w:t>
-            </w:r>
-            <w:r>
-              <w:rPr>
-                <w:b/>
-              </w:rPr>
-              <w:t>:</w:t>
+              <w:t>Task:</w:t>
             </w:r>
             <w:r>
               <w:rPr>
@@ -2531,8 +2898,21 @@
               </w:rPr>
               <w:t xml:space="preserve">Task: </w:t>
             </w:r>
-            <w:r>
-              <w:t>Practise JavaScript destructuring and begin a personal portfolio project.</w:t>
+            <w:proofErr w:type="spellStart"/>
+            <w:r>
+              <w:t>Practise</w:t>
+            </w:r>
+            <w:proofErr w:type="spellEnd"/>
+            <w:r>
+              <w:t xml:space="preserve"> JavaScript </w:t>
+            </w:r>
+            <w:proofErr w:type="spellStart"/>
+            <w:r>
+              <w:t>destructuring</w:t>
+            </w:r>
+            <w:proofErr w:type="spellEnd"/>
+            <w:r>
+              <w:t xml:space="preserve"> and begin a personal portfolio project.</w:t>
             </w:r>
           </w:p>
         </w:tc>
@@ -2642,7 +3022,21 @@
               <w:rPr>
                 <w:b/>
               </w:rPr>
-              <w:t>Details of Work Allotted Till Next Session /Corrections Suggested/Faculty Remarks</w:t>
+              <w:t xml:space="preserve">Details of Work Allotted </w:t>
+            </w:r>
+            <w:proofErr w:type="gramStart"/>
+            <w:r>
+              <w:rPr>
+                <w:b/>
+              </w:rPr>
+              <w:t>Till</w:t>
+            </w:r>
+            <w:proofErr w:type="gramEnd"/>
+            <w:r>
+              <w:rPr>
+                <w:b/>
+              </w:rPr>
+              <w:t xml:space="preserve"> Next Session /Corrections Suggested/Faculty Remarks</w:t>
             </w:r>
           </w:p>
         </w:tc>
@@ -2721,8 +3115,29 @@
             <w:tcW w:w="3738" w:type="dxa"/>
           </w:tcPr>
           <w:p>
-            <w:r>
-              <w:t>Practised JavaScript destructuring for nested arrays and objects; developed a 3D book-style portfolio website (HTML, CSS, JavaScript, Boxicons) with page-turn and scroll-navigation effects, deployed on Netlify.</w:t>
+            <w:proofErr w:type="spellStart"/>
+            <w:r>
+              <w:t>Practised</w:t>
+            </w:r>
+            <w:proofErr w:type="spellEnd"/>
+            <w:r>
+              <w:t xml:space="preserve"> JavaScript </w:t>
+            </w:r>
+            <w:proofErr w:type="spellStart"/>
+            <w:r>
+              <w:t>destructuring</w:t>
+            </w:r>
+            <w:proofErr w:type="spellEnd"/>
+            <w:r>
+              <w:t xml:space="preserve"> for nested arrays and objects; developed a 3D book-style portfolio website (HTML, CSS, JavaScript, </w:t>
+            </w:r>
+            <w:proofErr w:type="spellStart"/>
+            <w:r>
+              <w:t>Boxicons</w:t>
+            </w:r>
+            <w:proofErr w:type="spellEnd"/>
+            <w:r>
+              <w:t>) with page-turn and scroll-navigation effects, deployed on Netlify.</w:t>
             </w:r>
           </w:p>
         </w:tc>
@@ -2738,7 +3153,15 @@
               <w:t xml:space="preserve">Task: </w:t>
             </w:r>
             <w:r>
-              <w:t>Study JavaScript Promises with resolve/reject, setTimeout and then/catch handling.</w:t>
+              <w:t xml:space="preserve">Study JavaScript Promises with resolve/reject, </w:t>
+            </w:r>
+            <w:proofErr w:type="spellStart"/>
+            <w:r>
+              <w:t>setTimeout</w:t>
+            </w:r>
+            <w:proofErr w:type="spellEnd"/>
+            <w:r>
+              <w:t xml:space="preserve"> and then/catch handling.</w:t>
             </w:r>
           </w:p>
         </w:tc>
@@ -2788,7 +3211,15 @@
           </w:tcPr>
           <w:p>
             <w:r>
-              <w:t>Studied JavaScript Promises — created a Withdraw function returning a Promise that resolves on success and rejects on invalid/insufficient funds, handled with setTimeout, then and catch.</w:t>
+              <w:t xml:space="preserve">Studied JavaScript Promises — created a Withdraw function returning a Promise that resolves on success and rejects on invalid/insufficient funds, handled with </w:t>
+            </w:r>
+            <w:proofErr w:type="spellStart"/>
+            <w:r>
+              <w:t>setTimeout</w:t>
+            </w:r>
+            <w:proofErr w:type="spellEnd"/>
+            <w:r>
+              <w:t>, then and catch.</w:t>
             </w:r>
           </w:p>
         </w:tc>
@@ -2854,7 +3285,15 @@
           </w:tcPr>
           <w:p>
             <w:r>
-              <w:t>Scaffolded the first React 19 projects with Vite (1st-project and a Basic-form) — ran npm install, started the Vite dev server and explored the React component structure and JSX.</w:t>
+              <w:t xml:space="preserve">Scaffolded the first React 19 projects with Vite (1st-project and a Basic-form) — ran </w:t>
+            </w:r>
+            <w:proofErr w:type="spellStart"/>
+            <w:r>
+              <w:t>npm</w:t>
+            </w:r>
+            <w:proofErr w:type="spellEnd"/>
+            <w:r>
+              <w:t xml:space="preserve"> install, started the Vite dev server and explored the React component structure and JSX.</w:t>
             </w:r>
           </w:p>
         </w:tc>
@@ -2920,7 +3359,15 @@
           </w:tcPr>
           <w:p>
             <w:r>
-              <w:t xml:space="preserve">Group Presentation on the Agile Methodology and it </w:t>
+              <w:t xml:space="preserve">Group Presentation on the Agile Methodology and </w:t>
+            </w:r>
+            <w:proofErr w:type="gramStart"/>
+            <w:r>
+              <w:t>it</w:t>
+            </w:r>
+            <w:proofErr w:type="gramEnd"/>
+            <w:r>
+              <w:t xml:space="preserve"> </w:t>
             </w:r>
             <w:r>
               <w:t>full history</w:t>
@@ -3263,7 +3710,21 @@
               <w:rPr>
                 <w:b/>
               </w:rPr>
-              <w:t>Details of Work Allotted Till Next Session /Corrections Suggested/Faculty Remarks</w:t>
+              <w:t xml:space="preserve">Details of Work Allotted </w:t>
+            </w:r>
+            <w:proofErr w:type="gramStart"/>
+            <w:r>
+              <w:rPr>
+                <w:b/>
+              </w:rPr>
+              <w:t>Till</w:t>
+            </w:r>
+            <w:proofErr w:type="gramEnd"/>
+            <w:r>
+              <w:rPr>
+                <w:b/>
+              </w:rPr>
+              <w:t xml:space="preserve"> Next Session /Corrections Suggested/Faculty Remarks</w:t>
             </w:r>
           </w:p>
         </w:tc>
@@ -3343,7 +3804,13 @@
           </w:tcPr>
           <w:p>
             <w:r>
-              <w:t>-</w:t>
+              <w:t>UI</w:t>
+            </w:r>
+            <w:r>
+              <w:t xml:space="preserve">/ UX basic and with the color theory and </w:t>
+            </w:r>
+            <w:r>
+              <w:t>contract and how user experience can be optimized</w:t>
             </w:r>
           </w:p>
         </w:tc>
@@ -3823,7 +4290,21 @@
               <w:rPr>
                 <w:b/>
               </w:rPr>
-              <w:t>Details of Work Allotted Till Next Session /Corrections Suggested/Faculty Remarks</w:t>
+              <w:t xml:space="preserve">Details of Work Allotted </w:t>
+            </w:r>
+            <w:proofErr w:type="gramStart"/>
+            <w:r>
+              <w:rPr>
+                <w:b/>
+              </w:rPr>
+              <w:t>Till</w:t>
+            </w:r>
+            <w:proofErr w:type="gramEnd"/>
+            <w:r>
+              <w:rPr>
+                <w:b/>
+              </w:rPr>
+              <w:t xml:space="preserve"> Next Session /Corrections Suggested/Faculty Remarks</w:t>
             </w:r>
           </w:p>
         </w:tc>
@@ -4383,7 +4864,21 @@
               <w:rPr>
                 <w:b/>
               </w:rPr>
-              <w:t>Details of Work Allotted Till Next Session /Corrections Suggested/Faculty Remarks</w:t>
+              <w:t xml:space="preserve">Details of Work Allotted </w:t>
+            </w:r>
+            <w:proofErr w:type="gramStart"/>
+            <w:r>
+              <w:rPr>
+                <w:b/>
+              </w:rPr>
+              <w:t>Till</w:t>
+            </w:r>
+            <w:proofErr w:type="gramEnd"/>
+            <w:r>
+              <w:rPr>
+                <w:b/>
+              </w:rPr>
+              <w:t xml:space="preserve"> Next Session /Corrections Suggested/Faculty Remarks</w:t>
             </w:r>
           </w:p>
         </w:tc>
@@ -4943,7 +5438,21 @@
               <w:rPr>
                 <w:b/>
               </w:rPr>
-              <w:t>Details of Work Allotted Till Next Session /Corrections Suggested/Faculty Remarks</w:t>
+              <w:t xml:space="preserve">Details of Work Allotted </w:t>
+            </w:r>
+            <w:proofErr w:type="gramStart"/>
+            <w:r>
+              <w:rPr>
+                <w:b/>
+              </w:rPr>
+              <w:t>Till</w:t>
+            </w:r>
+            <w:proofErr w:type="gramEnd"/>
+            <w:r>
+              <w:rPr>
+                <w:b/>
+              </w:rPr>
+              <w:t xml:space="preserve"> Next Session /Corrections Suggested/Faculty Remarks</w:t>
             </w:r>
           </w:p>
         </w:tc>
@@ -5503,7 +6012,21 @@
               <w:rPr>
                 <w:b/>
               </w:rPr>
-              <w:t>Details of Work Allotted Till Next Session /Corrections Suggested/Faculty Remarks</w:t>
+              <w:t xml:space="preserve">Details of Work Allotted </w:t>
+            </w:r>
+            <w:proofErr w:type="gramStart"/>
+            <w:r>
+              <w:rPr>
+                <w:b/>
+              </w:rPr>
+              <w:t>Till</w:t>
+            </w:r>
+            <w:proofErr w:type="gramEnd"/>
+            <w:r>
+              <w:rPr>
+                <w:b/>
+              </w:rPr>
+              <w:t xml:space="preserve"> Next Session /Corrections Suggested/Faculty Remarks</w:t>
             </w:r>
           </w:p>
         </w:tc>
@@ -6063,7 +6586,21 @@
               <w:rPr>
                 <w:b/>
               </w:rPr>
-              <w:t>Details of Work Allotted Till Next Session /Corrections Suggested/Faculty Remarks</w:t>
+              <w:t xml:space="preserve">Details of Work Allotted </w:t>
+            </w:r>
+            <w:proofErr w:type="gramStart"/>
+            <w:r>
+              <w:rPr>
+                <w:b/>
+              </w:rPr>
+              <w:t>Till</w:t>
+            </w:r>
+            <w:proofErr w:type="gramEnd"/>
+            <w:r>
+              <w:rPr>
+                <w:b/>
+              </w:rPr>
+              <w:t xml:space="preserve"> Next Session /Corrections Suggested/Faculty Remarks</w:t>
             </w:r>
           </w:p>
         </w:tc>
@@ -6623,7 +7160,21 @@
               <w:rPr>
                 <w:b/>
               </w:rPr>
-              <w:t>Details of Work Allotted Till Next Session /Corrections Suggested/Faculty Remarks</w:t>
+              <w:t xml:space="preserve">Details of Work Allotted </w:t>
+            </w:r>
+            <w:proofErr w:type="gramStart"/>
+            <w:r>
+              <w:rPr>
+                <w:b/>
+              </w:rPr>
+              <w:t>Till</w:t>
+            </w:r>
+            <w:proofErr w:type="gramEnd"/>
+            <w:r>
+              <w:rPr>
+                <w:b/>
+              </w:rPr>
+              <w:t xml:space="preserve"> Next Session /Corrections Suggested/Faculty Remarks</w:t>
             </w:r>
           </w:p>
         </w:tc>
@@ -7183,7 +7734,21 @@
               <w:rPr>
                 <w:b/>
               </w:rPr>
-              <w:t>Details of Work Allotted Till Next Session /Corrections Suggested/Faculty Remarks</w:t>
+              <w:t xml:space="preserve">Details of Work Allotted </w:t>
+            </w:r>
+            <w:proofErr w:type="gramStart"/>
+            <w:r>
+              <w:rPr>
+                <w:b/>
+              </w:rPr>
+              <w:t>Till</w:t>
+            </w:r>
+            <w:proofErr w:type="gramEnd"/>
+            <w:r>
+              <w:rPr>
+                <w:b/>
+              </w:rPr>
+              <w:t xml:space="preserve"> Next Session /Corrections Suggested/Faculty Remarks</w:t>
             </w:r>
           </w:p>
         </w:tc>
@@ -7743,7 +8308,21 @@
               <w:rPr>
                 <w:b/>
               </w:rPr>
-              <w:t>Details of Work Allotted Till Next Session /Corrections Suggested/Faculty Remarks</w:t>
+              <w:t xml:space="preserve">Details of Work Allotted </w:t>
+            </w:r>
+            <w:proofErr w:type="gramStart"/>
+            <w:r>
+              <w:rPr>
+                <w:b/>
+              </w:rPr>
+              <w:t>Till</w:t>
+            </w:r>
+            <w:proofErr w:type="gramEnd"/>
+            <w:r>
+              <w:rPr>
+                <w:b/>
+              </w:rPr>
+              <w:t xml:space="preserve"> Next Session /Corrections Suggested/Faculty Remarks</w:t>
             </w:r>
           </w:p>
         </w:tc>
@@ -8673,6 +9252,7 @@
   <w:style w:type="character" w:default="1" w:styleId="DefaultParagraphFont">
     <w:name w:val="Default Paragraph Font"/>
     <w:uiPriority w:val="1"/>
+    <w:semiHidden/>
     <w:unhideWhenUsed/>
   </w:style>
   <w:style w:type="table" w:default="1" w:styleId="TableNormal">

</xml_diff>